<commit_message>
Add Google Colab participant handout with all links
- docs/AI_Lab_Colab_Instructions.docx: what is needed, how to open and run
  a notebook, saving a copy in Drive, notebook order, troubleshooting and
  the full Colab link of every notebook and solution.
- README: full link column next to each Open-in-Colab badge.
- IT setup guide: points to the handout.

Co-Authored-By: Claude Opus 5.5 <noreply@anthropic.com>
Claude-Session: https://claude.ai/code/session_01T8ves2m2YhbnkRZGCkgsnW
</commit_message>
<xml_diff>
--- a/docs/AI_Lab_IT_Setup_Guide.docx
+++ b/docs/AI_Lab_IT_Setup_Guide.docx
@@ -4199,7 +4199,23 @@
                 <w:sz w:val="19"/>
                 <w:szCs w:val="19"/>
               </w:rPr>
-              <w:t xml:space="preserve"> link at the top; the README lists them all.</w:t>
+              <w:t xml:space="preserve"> link at the top; the README and the participant handout </w:t>
+            </w:r>
+            <w:r>
+              <w:rPr>
+                <w:rFonts w:ascii="Consolas" w:cs="Consolas" w:eastAsia="Consolas" w:hAnsi="Consolas"/>
+                <w:color w:val="1F3864"/>
+                <w:sz w:val="18"/>
+                <w:szCs w:val="18"/>
+              </w:rPr>
+              <w:t xml:space="preserve">AI_Lab_Colab_Instructions.docx</w:t>
+            </w:r>
+            <w:r>
+              <w:rPr>
+                <w:sz w:val="19"/>
+                <w:szCs w:val="19"/>
+              </w:rPr>
+              <w:t xml:space="preserve"> list them all.</w:t>
             </w:r>
           </w:p>
         </w:tc>

</xml_diff>